<commit_message>
Shorten worksheet to two pages with 11 codes
Keys and six treble codes on page 1; two bass and three mixed-clef
codes on page 2, in smaller print. Answer key updated to match.

Co-Authored-By: Claude Sonnet 5.5 <noreply@anthropic.com>
Claude-Session: https://claude.ai/code/session_01ESBGYUe9qNtrpvApBi28BQ
</commit_message>
<xml_diff>
--- a/demo-materials/ClassroomBridge-CrackTheCode-AnswerKey.docx
+++ b/demo-materials/ClassroomBridge-CrackTheCode-AnswerKey.docx
@@ -22,7 +22,7 @@
             <w:r>
               <w:rPr>
                 <w:b/>
-                <w:sz w:val="68"/>
+                <w:sz w:val="56"/>
               </w:rPr>
               <w:t>Crack the Code: Answer key</w:t>
             </w:r>
@@ -32,7 +32,7 @@
               <w:rPr>
                 <w:b/>
                 <w:color w:val="C97C00"/>
-                <w:sz w:val="36"/>
+                <w:sz w:val="26"/>
               </w:rPr>
               <w:t>For the teacher. Do not hand out.</w:t>
             </w:r>
@@ -88,7 +88,7 @@
           </w:p>
           <w:p>
             <w:pPr>
-              <w:spacing w:before="60"/>
+              <w:spacing w:before="120"/>
             </w:pPr>
             <w:r>
               <w:rPr>
@@ -101,14 +101,14 @@
             <w:r>
               <w:rPr>
                 <w:b/>
-                <w:sz w:val="40"/>
+                <w:sz w:val="44"/>
               </w:rPr>
-              <w:t>ACE</w:t>
+              <w:t>BAG</w:t>
             </w:r>
           </w:p>
           <w:p>
             <w:pPr>
-              <w:spacing w:before="60"/>
+              <w:spacing w:before="120"/>
             </w:pPr>
             <w:r>
               <w:rPr>
@@ -121,14 +121,14 @@
             <w:r>
               <w:rPr>
                 <w:b/>
-                <w:sz w:val="40"/>
+                <w:sz w:val="44"/>
               </w:rPr>
-              <w:t>BAG</w:t>
+              <w:t>FACE</w:t>
             </w:r>
           </w:p>
           <w:p>
             <w:pPr>
-              <w:spacing w:before="60"/>
+              <w:spacing w:before="120"/>
             </w:pPr>
             <w:r>
               <w:rPr>
@@ -141,14 +141,14 @@
             <w:r>
               <w:rPr>
                 <w:b/>
-                <w:sz w:val="40"/>
+                <w:sz w:val="44"/>
               </w:rPr>
-              <w:t>EGG</w:t>
+              <w:t>CAGE</w:t>
             </w:r>
           </w:p>
           <w:p>
             <w:pPr>
-              <w:spacing w:before="60"/>
+              <w:spacing w:before="120"/>
             </w:pPr>
             <w:r>
               <w:rPr>
@@ -161,14 +161,14 @@
             <w:r>
               <w:rPr>
                 <w:b/>
-                <w:sz w:val="40"/>
+                <w:sz w:val="44"/>
               </w:rPr>
-              <w:t>BED</w:t>
+              <w:t>BEAD</w:t>
             </w:r>
           </w:p>
           <w:p>
             <w:pPr>
-              <w:spacing w:before="60"/>
+              <w:spacing w:before="120"/>
             </w:pPr>
             <w:r>
               <w:rPr>
@@ -181,14 +181,14 @@
             <w:r>
               <w:rPr>
                 <w:b/>
-                <w:sz w:val="40"/>
+                <w:sz w:val="44"/>
               </w:rPr>
-              <w:t>FACE</w:t>
+              <w:t>BADGE</w:t>
             </w:r>
           </w:p>
           <w:p>
             <w:pPr>
-              <w:spacing w:before="60"/>
+              <w:spacing w:before="120"/>
             </w:pPr>
             <w:r>
               <w:rPr>
@@ -201,129 +201,9 @@
             <w:r>
               <w:rPr>
                 <w:b/>
-                <w:sz w:val="40"/>
-              </w:rPr>
-              <w:t>CAGE</w:t>
-            </w:r>
-          </w:p>
-          <w:p>
-            <w:pPr>
-              <w:spacing w:before="60"/>
-            </w:pPr>
-            <w:r>
-              <w:rPr>
-                <w:b/>
-                <w:color w:val="C97C00"/>
-                <w:sz w:val="36"/>
-              </w:rPr>
-              <w:t xml:space="preserve">7.  </w:t>
-            </w:r>
-            <w:r>
-              <w:rPr>
-                <w:b/>
-                <w:sz w:val="40"/>
-              </w:rPr>
-              <w:t>FADE</w:t>
-            </w:r>
-          </w:p>
-          <w:p>
-            <w:pPr>
-              <w:spacing w:before="60"/>
-            </w:pPr>
-            <w:r>
-              <w:rPr>
-                <w:b/>
-                <w:color w:val="C97C00"/>
-                <w:sz w:val="36"/>
-              </w:rPr>
-              <w:t xml:space="preserve">8.  </w:t>
-            </w:r>
-            <w:r>
-              <w:rPr>
-                <w:b/>
-                <w:sz w:val="40"/>
-              </w:rPr>
-              <w:t>BEAD</w:t>
-            </w:r>
-          </w:p>
-          <w:p>
-            <w:pPr>
-              <w:spacing w:before="60"/>
-            </w:pPr>
-            <w:r>
-              <w:rPr>
-                <w:b/>
-                <w:color w:val="C97C00"/>
-                <w:sz w:val="36"/>
-              </w:rPr>
-              <w:t xml:space="preserve">9.  </w:t>
-            </w:r>
-            <w:r>
-              <w:rPr>
-                <w:b/>
-                <w:sz w:val="40"/>
-              </w:rPr>
-              <w:t>FEED</w:t>
-            </w:r>
-          </w:p>
-          <w:p>
-            <w:pPr>
-              <w:spacing w:before="60"/>
-            </w:pPr>
-            <w:r>
-              <w:rPr>
-                <w:b/>
-                <w:color w:val="C97C00"/>
-                <w:sz w:val="36"/>
-              </w:rPr>
-              <w:t xml:space="preserve">10.  </w:t>
-            </w:r>
-            <w:r>
-              <w:rPr>
-                <w:b/>
-                <w:sz w:val="40"/>
-              </w:rPr>
-              <w:t>BADGE</w:t>
-            </w:r>
-          </w:p>
-          <w:p>
-            <w:pPr>
-              <w:spacing w:before="60"/>
-            </w:pPr>
-            <w:r>
-              <w:rPr>
-                <w:b/>
-                <w:color w:val="C97C00"/>
-                <w:sz w:val="36"/>
-              </w:rPr>
-              <w:t xml:space="preserve">11.  </w:t>
-            </w:r>
-            <w:r>
-              <w:rPr>
-                <w:b/>
-                <w:sz w:val="40"/>
+                <w:sz w:val="44"/>
               </w:rPr>
               <w:t>DECADE</w:t>
-            </w:r>
-          </w:p>
-          <w:p>
-            <w:pPr>
-              <w:spacing w:before="60"/>
-            </w:pPr>
-            <w:r>
-              <w:rPr>
-                <w:b/>
-                <w:color w:val="C97C00"/>
-                <w:sz w:val="36"/>
-              </w:rPr>
-              <w:t xml:space="preserve">12.  </w:t>
-            </w:r>
-            <w:r>
-              <w:rPr>
-                <w:b/>
-                <w:sz w:val="40"/>
-              </w:rPr>
-              <w:t>FACADE</w:t>
             </w:r>
           </w:p>
         </w:tc>
@@ -343,7 +223,7 @@
           </w:p>
           <w:p>
             <w:pPr>
-              <w:spacing w:before="60"/>
+              <w:spacing w:before="120"/>
             </w:pPr>
             <w:r>
               <w:rPr>
@@ -356,14 +236,14 @@
             <w:r>
               <w:rPr>
                 <w:b/>
-                <w:sz w:val="40"/>
+                <w:sz w:val="44"/>
               </w:rPr>
-              <w:t>ADD</w:t>
+              <w:t>BEAD</w:t>
             </w:r>
           </w:p>
           <w:p>
             <w:pPr>
-              <w:spacing w:before="60"/>
+              <w:spacing w:before="120"/>
             </w:pPr>
             <w:r>
               <w:rPr>
@@ -376,209 +256,9 @@
             <w:r>
               <w:rPr>
                 <w:b/>
-                <w:sz w:val="40"/>
-              </w:rPr>
-              <w:t>ACE</w:t>
-            </w:r>
-          </w:p>
-          <w:p>
-            <w:pPr>
-              <w:spacing w:before="60"/>
-            </w:pPr>
-            <w:r>
-              <w:rPr>
-                <w:b/>
-                <w:color w:val="C97C00"/>
-                <w:sz w:val="36"/>
-              </w:rPr>
-              <w:t xml:space="preserve">3.  </w:t>
-            </w:r>
-            <w:r>
-              <w:rPr>
-                <w:b/>
-                <w:sz w:val="40"/>
-              </w:rPr>
-              <w:t>BEG</w:t>
-            </w:r>
-          </w:p>
-          <w:p>
-            <w:pPr>
-              <w:spacing w:before="60"/>
-            </w:pPr>
-            <w:r>
-              <w:rPr>
-                <w:b/>
-                <w:color w:val="C97C00"/>
-                <w:sz w:val="36"/>
-              </w:rPr>
-              <w:t xml:space="preserve">4.  </w:t>
-            </w:r>
-            <w:r>
-              <w:rPr>
-                <w:b/>
-                <w:sz w:val="40"/>
-              </w:rPr>
-              <w:t>BED</w:t>
-            </w:r>
-          </w:p>
-          <w:p>
-            <w:pPr>
-              <w:spacing w:before="60"/>
-            </w:pPr>
-            <w:r>
-              <w:rPr>
-                <w:b/>
-                <w:color w:val="C97C00"/>
-                <w:sz w:val="36"/>
-              </w:rPr>
-              <w:t xml:space="preserve">5.  </w:t>
-            </w:r>
-            <w:r>
-              <w:rPr>
-                <w:b/>
-                <w:sz w:val="40"/>
-              </w:rPr>
-              <w:t>CAFE</w:t>
-            </w:r>
-          </w:p>
-          <w:p>
-            <w:pPr>
-              <w:spacing w:before="60"/>
-            </w:pPr>
-            <w:r>
-              <w:rPr>
-                <w:b/>
-                <w:color w:val="C97C00"/>
-                <w:sz w:val="36"/>
-              </w:rPr>
-              <w:t xml:space="preserve">6.  </w:t>
-            </w:r>
-            <w:r>
-              <w:rPr>
-                <w:b/>
-                <w:sz w:val="40"/>
-              </w:rPr>
-              <w:t>FACE</w:t>
-            </w:r>
-          </w:p>
-          <w:p>
-            <w:pPr>
-              <w:spacing w:before="60"/>
-            </w:pPr>
-            <w:r>
-              <w:rPr>
-                <w:b/>
-                <w:color w:val="C97C00"/>
-                <w:sz w:val="36"/>
-              </w:rPr>
-              <w:t xml:space="preserve">7.  </w:t>
-            </w:r>
-            <w:r>
-              <w:rPr>
-                <w:b/>
-                <w:sz w:val="40"/>
-              </w:rPr>
-              <w:t>FEED</w:t>
-            </w:r>
-          </w:p>
-          <w:p>
-            <w:pPr>
-              <w:spacing w:before="60"/>
-            </w:pPr>
-            <w:r>
-              <w:rPr>
-                <w:b/>
-                <w:color w:val="C97C00"/>
-                <w:sz w:val="36"/>
-              </w:rPr>
-              <w:t xml:space="preserve">8.  </w:t>
-            </w:r>
-            <w:r>
-              <w:rPr>
-                <w:b/>
-                <w:sz w:val="40"/>
-              </w:rPr>
-              <w:t>BEAD</w:t>
-            </w:r>
-          </w:p>
-          <w:p>
-            <w:pPr>
-              <w:spacing w:before="60"/>
-            </w:pPr>
-            <w:r>
-              <w:rPr>
-                <w:b/>
-                <w:color w:val="C97C00"/>
-                <w:sz w:val="36"/>
-              </w:rPr>
-              <w:t xml:space="preserve">9.  </w:t>
-            </w:r>
-            <w:r>
-              <w:rPr>
-                <w:b/>
-                <w:sz w:val="40"/>
-              </w:rPr>
-              <w:t>BADGE</w:t>
-            </w:r>
-          </w:p>
-          <w:p>
-            <w:pPr>
-              <w:spacing w:before="60"/>
-            </w:pPr>
-            <w:r>
-              <w:rPr>
-                <w:b/>
-                <w:color w:val="C97C00"/>
-                <w:sz w:val="36"/>
-              </w:rPr>
-              <w:t xml:space="preserve">10.  </w:t>
-            </w:r>
-            <w:r>
-              <w:rPr>
-                <w:b/>
-                <w:sz w:val="40"/>
+                <w:sz w:val="44"/>
               </w:rPr>
               <w:t>FADED</w:t>
-            </w:r>
-          </w:p>
-          <w:p>
-            <w:pPr>
-              <w:spacing w:before="60"/>
-            </w:pPr>
-            <w:r>
-              <w:rPr>
-                <w:b/>
-                <w:color w:val="C97C00"/>
-                <w:sz w:val="36"/>
-              </w:rPr>
-              <w:t xml:space="preserve">11.  </w:t>
-            </w:r>
-            <w:r>
-              <w:rPr>
-                <w:b/>
-                <w:sz w:val="40"/>
-              </w:rPr>
-              <w:t>DEFACE</w:t>
-            </w:r>
-          </w:p>
-          <w:p>
-            <w:pPr>
-              <w:spacing w:before="60"/>
-            </w:pPr>
-            <w:r>
-              <w:rPr>
-                <w:b/>
-                <w:color w:val="C97C00"/>
-                <w:sz w:val="36"/>
-              </w:rPr>
-              <w:t xml:space="preserve">12.  </w:t>
-            </w:r>
-            <w:r>
-              <w:rPr>
-                <w:b/>
-                <w:sz w:val="40"/>
-              </w:rPr>
-              <w:t>DECADE</w:t>
             </w:r>
           </w:p>
         </w:tc>
@@ -598,7 +278,7 @@
           </w:p>
           <w:p>
             <w:pPr>
-              <w:spacing w:before="60"/>
+              <w:spacing w:before="120"/>
             </w:pPr>
             <w:r>
               <w:rPr>
@@ -611,14 +291,14 @@
             <w:r>
               <w:rPr>
                 <w:b/>
-                <w:sz w:val="40"/>
+                <w:sz w:val="44"/>
               </w:rPr>
               <w:t>BAD EGG</w:t>
             </w:r>
           </w:p>
           <w:p>
             <w:pPr>
-              <w:spacing w:before="60"/>
+              <w:spacing w:before="120"/>
             </w:pPr>
             <w:r>
               <w:rPr>
@@ -631,14 +311,14 @@
             <w:r>
               <w:rPr>
                 <w:b/>
-                <w:sz w:val="40"/>
+                <w:sz w:val="44"/>
               </w:rPr>
-              <w:t>CAGE FEED</w:t>
+              <w:t>FACE CAFE</w:t>
             </w:r>
           </w:p>
           <w:p>
             <w:pPr>
-              <w:spacing w:before="60"/>
+              <w:spacing w:before="120"/>
             </w:pPr>
             <w:r>
               <w:rPr>
@@ -651,107 +331,7 @@
             <w:r>
               <w:rPr>
                 <w:b/>
-                <w:sz w:val="40"/>
-              </w:rPr>
-              <w:t>A BADGE</w:t>
-            </w:r>
-          </w:p>
-          <w:p>
-            <w:pPr>
-              <w:spacing w:before="60"/>
-            </w:pPr>
-            <w:r>
-              <w:rPr>
-                <w:b/>
-                <w:color w:val="C97C00"/>
-                <w:sz w:val="36"/>
-              </w:rPr>
-              <w:t xml:space="preserve">4.  </w:t>
-            </w:r>
-            <w:r>
-              <w:rPr>
-                <w:b/>
-                <w:sz w:val="40"/>
-              </w:rPr>
-              <w:t>FACE CAFE</w:t>
-            </w:r>
-          </w:p>
-          <w:p>
-            <w:pPr>
-              <w:spacing w:before="60"/>
-            </w:pPr>
-            <w:r>
-              <w:rPr>
-                <w:b/>
-                <w:color w:val="C97C00"/>
-                <w:sz w:val="36"/>
-              </w:rPr>
-              <w:t xml:space="preserve">5.  </w:t>
-            </w:r>
-            <w:r>
-              <w:rPr>
-                <w:b/>
-                <w:sz w:val="40"/>
-              </w:rPr>
-              <w:t>BEG DAD</w:t>
-            </w:r>
-          </w:p>
-          <w:p>
-            <w:pPr>
-              <w:spacing w:before="60"/>
-            </w:pPr>
-            <w:r>
-              <w:rPr>
-                <w:b/>
-                <w:color w:val="C97C00"/>
-                <w:sz w:val="36"/>
-              </w:rPr>
-              <w:t xml:space="preserve">6.  </w:t>
-            </w:r>
-            <w:r>
-              <w:rPr>
-                <w:b/>
-                <w:sz w:val="40"/>
-              </w:rPr>
-              <w:t>ADD EGG</w:t>
-            </w:r>
-          </w:p>
-          <w:p>
-            <w:pPr>
-              <w:spacing w:before="60"/>
-            </w:pPr>
-            <w:r>
-              <w:rPr>
-                <w:b/>
-                <w:color w:val="C97C00"/>
-                <w:sz w:val="36"/>
-              </w:rPr>
-              <w:t xml:space="preserve">7.  </w:t>
-            </w:r>
-            <w:r>
-              <w:rPr>
-                <w:b/>
-                <w:sz w:val="40"/>
-              </w:rPr>
-              <w:t>BEAD BAG</w:t>
-            </w:r>
-          </w:p>
-          <w:p>
-            <w:pPr>
-              <w:spacing w:before="60"/>
-            </w:pPr>
-            <w:r>
-              <w:rPr>
-                <w:b/>
-                <w:color w:val="C97C00"/>
-                <w:sz w:val="36"/>
-              </w:rPr>
-              <w:t xml:space="preserve">8.  </w:t>
-            </w:r>
-            <w:r>
-              <w:rPr>
-                <w:b/>
-                <w:sz w:val="40"/>
+                <w:sz w:val="44"/>
               </w:rPr>
               <w:t>A DECADE</w:t>
             </w:r>

</xml_diff>